<commit_message>
Add Martabe work instruction content to SWI 205-006, 201-022, 205-012, 205-013
Co-Authored-By: Claude Sonnet 5.5 <noreply@anthropic.com>
Claude-Session: https://claude.ai/code/session_0121qocWgsZdFAsne2oz9sHT
</commit_message>
<xml_diff>
--- a/SWI/201-Plant-Sampling/MM-4034-033-OR-03-SWI-PRO-MET-201-022-Online-Analyser-Verification-Sampling---pH-Cyanide-and-Dissolved-O-RevA.docx
+++ b/SWI/201-Plant-Sampling/MM-4034-033-OR-03-SWI-PRO-MET-201-022-Online-Analyser-Verification-Sampling---pH-Cyanide-and-Dissolved-O-RevA.docx
@@ -602,6 +602,60 @@
       <w:pPr>
         <w:spacing w:after="100" w:before="0" w:line="245"/>
       </w:pPr>
+    </w:p>
+    <w:tbl>
+      <w:tblPr>
+        <w:tblW w:type="dxa" w:w="9026"/>
+        <w:tblBorders>
+          <w:left w:val="single" w:color="B7791F" w:sz="18"/>
+        </w:tblBorders>
+        <w:tblCellMar>
+          <w:top w:type="dxa" w:w="90"/>
+          <w:left w:type="dxa" w:w="150"/>
+          <w:bottom w:type="dxa" w:w="90"/>
+          <w:right w:type="dxa" w:w="120"/>
+        </w:tblCellMar>
+      </w:tblPr>
+      <w:tblGrid>
+        <w:gridCol w:w="9026"/>
+      </w:tblGrid>
+      <w:tr>
+        <w:tc>
+          <w:tcPr>
+            <w:tcW w:type="dxa" w:w="9026"/>
+            <w:shd w:val="clear" w:color="auto" w:fill="FFF4D6"/>
+          </w:tcPr>
+          <w:p>
+            <w:pPr>
+              <w:spacing w:after="0" w:before="0" w:line="245"/>
+            </w:pPr>
+            <w:r>
+              <w:rPr>
+                <w:rFonts w:ascii="Calibri" w:cs="Calibri" w:eastAsia="Calibri" w:hAnsi="Calibri"/>
+                <w:b/>
+                <w:bCs/>
+                <w:color w:val="7A4B00"/>
+                <w:sz w:val="17"/>
+                <w:szCs w:val="17"/>
+              </w:rPr>
+              <w:t xml:space="preserve">DRAFT FOR REVIEW. Martabe work instruction 'Verifikasi Analyzer Leaching' (12/05/2025) added as Section 6 Part B. Not approved until reviewed. JSEA JSEA-PRO-MET-201-022 must be updated for the added hazard row.</w:t>
+            </w:r>
+          </w:p>
+        </w:tc>
+      </w:tr>
+    </w:tbl>
+    <w:p>
+      <w:pPr>
+        <w:spacing w:after="60" w:before="0" w:line="245"/>
+      </w:pPr>
+      <w:r>
+        <w:rPr>
+          <w:rFonts w:ascii="Calibri" w:cs="Calibri" w:eastAsia="Calibri" w:hAnsi="Calibri"/>
+          <w:sz w:val="17"/>
+          <w:szCs w:val="17"/>
+        </w:rPr>
+        <w:t xml:space="preserve"/>
+      </w:r>
     </w:p>
     <w:p>
       <w:pPr>
@@ -1487,6 +1541,56 @@
           </w:p>
         </w:tc>
       </w:tr>
+      <w:tr>
+        <w:tc>
+          <w:tcPr>
+            <w:tcW w:type="dxa" w:w="2900"/>
+            <w:tcMar>
+              <w:top w:type="dxa" w:w="55"/>
+              <w:left w:type="dxa" w:w="85"/>
+              <w:bottom w:type="dxa" w:w="55"/>
+              <w:right w:type="dxa" w:w="85"/>
+            </w:tcMar>
+          </w:tcPr>
+          <w:p>
+            <w:pPr>
+              <w:spacing w:after="0" w:line="235"/>
+            </w:pPr>
+            <w:r>
+              <w:rPr>
+                <w:rFonts w:ascii="Calibri" w:cs="Calibri" w:eastAsia="Calibri" w:hAnsi="Calibri"/>
+                <w:sz w:val="16"/>
+                <w:szCs w:val="16"/>
+              </w:rPr>
+              <w:t xml:space="preserve">[JSEA to confirm] Filtering slurry on the filter press and adding caustic to cyanide solution at the bench</w:t>
+            </w:r>
+          </w:p>
+        </w:tc>
+        <w:tc>
+          <w:tcPr>
+            <w:tcW w:type="dxa" w:w="6126"/>
+            <w:tcMar>
+              <w:top w:type="dxa" w:w="55"/>
+              <w:left w:type="dxa" w:w="85"/>
+              <w:bottom w:type="dxa" w:w="55"/>
+              <w:right w:type="dxa" w:w="85"/>
+            </w:tcMar>
+          </w:tcPr>
+          <w:p>
+            <w:pPr>
+              <w:spacing w:after="0" w:line="235"/>
+            </w:pPr>
+            <w:r>
+              <w:rPr>
+                <w:rFonts w:ascii="Calibri" w:cs="Calibri" w:eastAsia="Calibri" w:hAnsi="Calibri"/>
+                <w:sz w:val="16"/>
+                <w:szCs w:val="16"/>
+              </w:rPr>
+              <w:t xml:space="preserve">Filter press operated to its manual with pressure relieved before opening. Caustic added to the solution, never the reverse, with chemical-resistant gloves, goggles and face shield. Filtrate handled as cyanide-bearing - no general drain.</w:t>
+            </w:r>
+          </w:p>
+        </w:tc>
+      </w:tr>
     </w:tbl>
     <w:p>
       <w:pPr>
@@ -2038,6 +2142,60 @@
     </w:p>
     <w:p>
       <w:pPr>
+        <w:pStyle w:val="ListParagraph"/>
+        <w:numPr>
+          <w:ilvl w:val="0"/>
+          <w:numId w:val="1"/>
+        </w:numPr>
+        <w:spacing w:after="60" w:line="245"/>
+      </w:pPr>
+      <w:r>
+        <w:rPr>
+          <w:rFonts w:ascii="Calibri" w:cs="Calibri" w:eastAsia="Calibri" w:hAnsi="Calibri"/>
+          <w:sz w:val="17"/>
+          <w:szCs w:val="17"/>
+        </w:rPr>
+        <w:t xml:space="preserve">[M] Leach analyser (reading the solution sample) and black 250 mL sample bottles</w:t>
+      </w:r>
+    </w:p>
+    <w:p>
+      <w:pPr>
+        <w:pStyle w:val="ListParagraph"/>
+        <w:numPr>
+          <w:ilvl w:val="0"/>
+          <w:numId w:val="1"/>
+        </w:numPr>
+        <w:spacing w:after="60" w:line="245"/>
+      </w:pPr>
+      <w:r>
+        <w:rPr>
+          <w:rFonts w:ascii="Calibri" w:cs="Calibri" w:eastAsia="Calibri" w:hAnsi="Calibri"/>
+          <w:sz w:val="17"/>
+          <w:szCs w:val="17"/>
+        </w:rPr>
+        <w:t xml:space="preserve">[M] 100 mL measuring cylinder and filter press</w:t>
+      </w:r>
+    </w:p>
+    <w:p>
+      <w:pPr>
+        <w:pStyle w:val="ListParagraph"/>
+        <w:numPr>
+          <w:ilvl w:val="0"/>
+          <w:numId w:val="1"/>
+        </w:numPr>
+        <w:spacing w:after="60" w:line="245"/>
+      </w:pPr>
+      <w:r>
+        <w:rPr>
+          <w:rFonts w:ascii="Calibri" w:cs="Calibri" w:eastAsia="Calibri" w:hAnsi="Calibri"/>
+          <w:sz w:val="17"/>
+          <w:szCs w:val="17"/>
+        </w:rPr>
+        <w:t xml:space="preserve">[M] Sodium hydroxide (caustic) to stabilise the solution sample</w:t>
+      </w:r>
+    </w:p>
+    <w:p>
+      <w:pPr>
         <w:pStyle w:val="Heading1"/>
         <w:spacing w:after="120" w:before="260"/>
       </w:pPr>
@@ -2055,6 +2213,23 @@
     </w:p>
     <w:p>
       <w:pPr>
+        <w:spacing w:after="90" w:before="180" w:line="245"/>
+        <w:keepNext/>
+      </w:pPr>
+      <w:r>
+        <w:rPr>
+          <w:rFonts w:ascii="Calibri" w:cs="Calibri" w:eastAsia="Calibri" w:hAnsi="Calibri"/>
+          <w:b/>
+          <w:bCs/>
+          <w:color w:val="1F3864"/>
+          <w:sz w:val="19"/>
+          <w:szCs w:val="19"/>
+        </w:rPr>
+        <w:t xml:space="preserve">Part A - Verification at the analyser sample point</w:t>
+      </w:r>
+    </w:p>
+    <w:p>
+      <w:pPr>
         <w:ind w:left="280"/>
         <w:spacing w:after="50" w:before="0" w:line="245"/>
       </w:pPr>
@@ -2195,6 +2370,193 @@
           <w:szCs w:val="17"/>
         </w:rPr>
         <w:t xml:space="preserve">  Submit a laboratory split so the field result itself is checked.</w:t>
+      </w:r>
+    </w:p>
+    <w:p>
+      <w:pPr>
+        <w:spacing w:after="90" w:before="180" w:line="245"/>
+        <w:keepNext/>
+      </w:pPr>
+      <w:r>
+        <w:rPr>
+          <w:rFonts w:ascii="Calibri" w:cs="Calibri" w:eastAsia="Calibri" w:hAnsi="Calibri"/>
+          <w:b/>
+          <w:bCs/>
+          <w:color w:val="1F3864"/>
+          <w:sz w:val="19"/>
+          <w:szCs w:val="19"/>
+        </w:rPr>
+        <w:t xml:space="preserve">Part B - Leach analyser verification against actual solution, leach tanks 1, 2 and 3 [M]</w:t>
+      </w:r>
+    </w:p>
+    <w:p>
+      <w:pPr>
+        <w:spacing w:after="60" w:before="0" w:line="245"/>
+      </w:pPr>
+      <w:r>
+        <w:rPr>
+          <w:rFonts w:ascii="Calibri" w:cs="Calibri" w:eastAsia="Calibri" w:hAnsi="Calibri"/>
+          <w:sz w:val="17"/>
+          <w:szCs w:val="17"/>
+        </w:rPr>
+        <w:t xml:space="preserve">[M] = taken from the Martabe team work instruction "Verifikasi Analyzer Leaching" (12/05/2025). [CONFIRM] = unspecified or inconsistent in the source; resolve before this instruction is approved for use. Part A (original steps) is unchanged.</w:t>
+      </w:r>
+    </w:p>
+    <w:p>
+      <w:pPr>
+        <w:spacing w:after="60" w:before="0" w:line="245"/>
+      </w:pPr>
+      <w:r>
+        <w:rPr>
+          <w:rFonts w:ascii="Calibri" w:cs="Calibri" w:eastAsia="Calibri" w:hAnsi="Calibri"/>
+          <w:sz w:val="17"/>
+          <w:szCs w:val="17"/>
+        </w:rPr>
+        <w:t xml:space="preserve">Purpose [M]: verify the leach analyser reading against the actual solution.</w:t>
+      </w:r>
+    </w:p>
+    <w:p>
+      <w:pPr>
+        <w:ind w:left="280"/>
+        <w:spacing w:after="50" w:before="0" w:line="245"/>
+      </w:pPr>
+      <w:r>
+        <w:rPr>
+          <w:rFonts w:ascii="Calibri" w:cs="Calibri" w:eastAsia="Calibri" w:hAnsi="Calibri"/>
+          <w:b/>
+          <w:bCs/>
+          <w:sz w:val="17"/>
+          <w:szCs w:val="17"/>
+        </w:rPr>
+        <w:t xml:space="preserve">1.</w:t>
+      </w:r>
+      <w:r>
+        <w:rPr>
+          <w:rFonts w:ascii="Calibri" w:cs="Calibri" w:eastAsia="Calibri" w:hAnsi="Calibri"/>
+          <w:sz w:val="17"/>
+          <w:szCs w:val="17"/>
+        </w:rPr>
+        <w:t xml:space="preserve">  Sample slurry from leach tank 1, 2 and 3, 3 L from each tank, then press each sample to obtain solution.</w:t>
+      </w:r>
+    </w:p>
+    <w:p>
+      <w:pPr>
+        <w:ind w:left="280"/>
+        <w:spacing w:after="50" w:before="0" w:line="245"/>
+      </w:pPr>
+      <w:r>
+        <w:rPr>
+          <w:rFonts w:ascii="Calibri" w:cs="Calibri" w:eastAsia="Calibri" w:hAnsi="Calibri"/>
+          <w:b/>
+          <w:bCs/>
+          <w:sz w:val="17"/>
+          <w:szCs w:val="17"/>
+        </w:rPr>
+        <w:t xml:space="preserve">2.</w:t>
+      </w:r>
+      <w:r>
+        <w:rPr>
+          <w:rFonts w:ascii="Calibri" w:cs="Calibri" w:eastAsia="Calibri" w:hAnsi="Calibri"/>
+          <w:sz w:val="17"/>
+          <w:szCs w:val="17"/>
+        </w:rPr>
+        <w:t xml:space="preserve">  Take 200 mL of each sample solution and add caustic. [CONFIRM] the quantity of caustic or the target pH is not stated in the source. Add enough to hold the solution pH above 10.5, in line with the HCN controls in Section 3.</w:t>
+      </w:r>
+    </w:p>
+    <w:p>
+      <w:pPr>
+        <w:ind w:left="280"/>
+        <w:spacing w:after="50" w:before="0" w:line="245"/>
+      </w:pPr>
+      <w:r>
+        <w:rPr>
+          <w:rFonts w:ascii="Calibri" w:cs="Calibri" w:eastAsia="Calibri" w:hAnsi="Calibri"/>
+          <w:b/>
+          <w:bCs/>
+          <w:sz w:val="17"/>
+          <w:szCs w:val="17"/>
+        </w:rPr>
+        <w:t xml:space="preserve">3.</w:t>
+      </w:r>
+      <w:r>
+        <w:rPr>
+          <w:rFonts w:ascii="Calibri" w:cs="Calibri" w:eastAsia="Calibri" w:hAnsi="Calibri"/>
+          <w:sz w:val="17"/>
+          <w:szCs w:val="17"/>
+        </w:rPr>
+        <w:t xml:space="preserve">  Read each solution on the leach analyser and record the NaCN and WAD CN values for each tank.</w:t>
+      </w:r>
+    </w:p>
+    <w:p>
+      <w:pPr>
+        <w:ind w:left="280"/>
+        <w:spacing w:after="50" w:before="0" w:line="245"/>
+      </w:pPr>
+      <w:r>
+        <w:rPr>
+          <w:rFonts w:ascii="Calibri" w:cs="Calibri" w:eastAsia="Calibri" w:hAnsi="Calibri"/>
+          <w:b/>
+          <w:bCs/>
+          <w:sz w:val="17"/>
+          <w:szCs w:val="17"/>
+        </w:rPr>
+        <w:t xml:space="preserve">4.</w:t>
+      </w:r>
+      <w:r>
+        <w:rPr>
+          <w:rFonts w:ascii="Calibri" w:cs="Calibri" w:eastAsia="Calibri" w:hAnsi="Calibri"/>
+          <w:sz w:val="17"/>
+          <w:szCs w:val="17"/>
+        </w:rPr>
+        <w:t xml:space="preserve">  Take 10 mL of the same solution, titrate (free cyanide, silver nitrate method) and record the NaCN found.</w:t>
+      </w:r>
+    </w:p>
+    <w:p>
+      <w:pPr>
+        <w:ind w:left="280"/>
+        <w:spacing w:after="50" w:before="0" w:line="245"/>
+      </w:pPr>
+      <w:r>
+        <w:rPr>
+          <w:rFonts w:ascii="Calibri" w:cs="Calibri" w:eastAsia="Calibri" w:hAnsi="Calibri"/>
+          <w:b/>
+          <w:bCs/>
+          <w:sz w:val="17"/>
+          <w:szCs w:val="17"/>
+        </w:rPr>
+        <w:t xml:space="preserve">5.</w:t>
+      </w:r>
+      <w:r>
+        <w:rPr>
+          <w:rFonts w:ascii="Calibri" w:cs="Calibri" w:eastAsia="Calibri" w:hAnsi="Calibri"/>
+          <w:sz w:val="17"/>
+          <w:szCs w:val="17"/>
+        </w:rPr>
+        <w:t xml:space="preserve">  Send the remaining sample to the ITS laboratory for NaCN, WAD CN and Cu in solution assay.</w:t>
+      </w:r>
+    </w:p>
+    <w:p>
+      <w:pPr>
+        <w:ind w:left="280"/>
+        <w:spacing w:after="50" w:before="0" w:line="245"/>
+      </w:pPr>
+      <w:r>
+        <w:rPr>
+          <w:rFonts w:ascii="Calibri" w:cs="Calibri" w:eastAsia="Calibri" w:hAnsi="Calibri"/>
+          <w:b/>
+          <w:bCs/>
+          <w:sz w:val="17"/>
+          <w:szCs w:val="17"/>
+        </w:rPr>
+        <w:t xml:space="preserve">6.</w:t>
+      </w:r>
+      <w:r>
+        <w:rPr>
+          <w:rFonts w:ascii="Calibri" w:cs="Calibri" w:eastAsia="Calibri" w:hAnsi="Calibri"/>
+          <w:sz w:val="17"/>
+          <w:szCs w:val="17"/>
+        </w:rPr>
+        <w:t xml:space="preserve">  Record the analyser, titration and laboratory results for each tank side by side in the analyser verification log. Apply Part A step 5 to any difference above tolerance - do not adjust the analyser.</w:t>
       </w:r>
     </w:p>
     <w:p>
@@ -2462,6 +2824,24 @@
           <w:szCs w:val="17"/>
         </w:rPr>
         <w:t xml:space="preserve">MM-4034-033-P-09 Tag Register (942 tags)</w:t>
+      </w:r>
+    </w:p>
+    <w:p>
+      <w:pPr>
+        <w:pStyle w:val="ListParagraph"/>
+        <w:numPr>
+          <w:ilvl w:val="0"/>
+          <w:numId w:val="1"/>
+        </w:numPr>
+        <w:spacing w:after="60" w:line="245"/>
+      </w:pPr>
+      <w:r>
+        <w:rPr>
+          <w:rFonts w:ascii="Calibri" w:cs="Calibri" w:eastAsia="Calibri" w:hAnsi="Calibri"/>
+          <w:sz w:val="17"/>
+          <w:szCs w:val="17"/>
+        </w:rPr>
+        <w:t xml:space="preserve">Martabe work instruction 'Verifikasi Analyzer Leaching' (Indonesian, 12/05/2025) - Part B source</w:t>
       </w:r>
     </w:p>
     <w:sectPr>

</xml_diff>